<commit_message>
update: add field taxID
</commit_message>
<xml_diff>
--- a/public/preview/template-user.docx
+++ b/public/preview/template-user.docx
@@ -116,6 +116,7 @@
       <w:tr>
         <w:trPr>
           <w:cnfStyle w:val="000000100000" w:firstRow="0" w:lastRow="0" w:firstColumn="0" w:lastColumn="0" w:oddVBand="0" w:evenVBand="0" w:oddHBand="1" w:evenHBand="0" w:firstRowFirstColumn="0" w:firstRowLastColumn="0" w:lastRowFirstColumn="0" w:lastRowLastColumn="0"/>
+          <w:trHeight w:val="198"/>
         </w:trPr>
         <w:tc>
           <w:tcPr>
@@ -198,7 +199,7 @@
           </w:tcPr>
           <w:p>
             <w:pPr>
-              <w:spacing w:line="312" w:lineRule="auto"/>
+              <w:spacing w:line="276" w:lineRule="auto"/>
               <w:cnfStyle w:val="000000100000" w:firstRow="0" w:lastRow="0" w:firstColumn="0" w:lastColumn="0" w:oddVBand="0" w:evenVBand="0" w:oddHBand="1" w:evenHBand="0" w:firstRowFirstColumn="0" w:firstRowLastColumn="0" w:lastRowFirstColumn="0" w:lastRowLastColumn="0"/>
               <w:rPr>
                 <w:rFonts w:cstheme="minorHAnsi"/>
@@ -237,7 +238,7 @@
           </w:tcPr>
           <w:p>
             <w:pPr>
-              <w:spacing w:line="312" w:lineRule="auto"/>
+              <w:spacing w:line="276" w:lineRule="auto"/>
               <w:cnfStyle w:val="000000100000" w:firstRow="0" w:lastRow="0" w:firstColumn="0" w:lastColumn="0" w:oddVBand="0" w:evenVBand="0" w:oddHBand="1" w:evenHBand="0" w:firstRowFirstColumn="0" w:firstRowLastColumn="0" w:lastRowFirstColumn="0" w:lastRowLastColumn="0"/>
               <w:rPr>
                 <w:rFonts w:cstheme="minorHAnsi"/>
@@ -253,6 +254,9 @@
         </w:tc>
       </w:tr>
       <w:tr>
+        <w:trPr>
+          <w:trHeight w:val="180"/>
+        </w:trPr>
         <w:tc>
           <w:tcPr>
             <w:cnfStyle w:val="001000000000" w:firstRow="0" w:lastRow="0" w:firstColumn="1" w:lastColumn="0" w:oddVBand="0" w:evenVBand="0" w:oddHBand="0" w:evenHBand="0" w:firstRowFirstColumn="0" w:firstRowLastColumn="0" w:lastRowFirstColumn="0" w:lastRowLastColumn="0"/>
@@ -336,7 +340,7 @@
           </w:tcPr>
           <w:p>
             <w:pPr>
-              <w:spacing w:line="312" w:lineRule="auto"/>
+              <w:spacing w:line="276" w:lineRule="auto"/>
               <w:cnfStyle w:val="000000000000" w:firstRow="0" w:lastRow="0" w:firstColumn="0" w:lastColumn="0" w:oddVBand="0" w:evenVBand="0" w:oddHBand="0" w:evenHBand="0" w:firstRowFirstColumn="0" w:firstRowLastColumn="0" w:lastRowFirstColumn="0" w:lastRowLastColumn="0"/>
               <w:rPr>
                 <w:rFonts w:cstheme="minorHAnsi"/>
@@ -375,7 +379,7 @@
           </w:tcPr>
           <w:p>
             <w:pPr>
-              <w:spacing w:line="312" w:lineRule="auto"/>
+              <w:spacing w:line="276" w:lineRule="auto"/>
               <w:cnfStyle w:val="000000000000" w:firstRow="0" w:lastRow="0" w:firstColumn="0" w:lastColumn="0" w:oddVBand="0" w:evenVBand="0" w:oddHBand="0" w:evenHBand="0" w:firstRowFirstColumn="0" w:firstRowLastColumn="0" w:lastRowFirstColumn="0" w:lastRowLastColumn="0"/>
               <w:rPr>
                 <w:rFonts w:cstheme="minorHAnsi"/>
@@ -393,7 +397,7 @@
       <w:tr>
         <w:trPr>
           <w:cnfStyle w:val="000000100000" w:firstRow="0" w:lastRow="0" w:firstColumn="0" w:lastColumn="0" w:oddVBand="0" w:evenVBand="0" w:oddHBand="1" w:evenHBand="0" w:firstRowFirstColumn="0" w:firstRowLastColumn="0" w:lastRowFirstColumn="0" w:lastRowLastColumn="0"/>
-          <w:trHeight w:val="368"/>
+          <w:trHeight w:val="180"/>
         </w:trPr>
         <w:tc>
           <w:tcPr>
@@ -480,6 +484,7 @@
           </w:tcPr>
           <w:p>
             <w:pPr>
+              <w:spacing w:line="276" w:lineRule="auto"/>
               <w:cnfStyle w:val="000000100000" w:firstRow="0" w:lastRow="0" w:firstColumn="0" w:lastColumn="0" w:oddVBand="0" w:evenVBand="0" w:oddHBand="1" w:evenHBand="0" w:firstRowFirstColumn="0" w:firstRowLastColumn="0" w:lastRowFirstColumn="0" w:lastRowLastColumn="0"/>
               <w:rPr>
                 <w:rFonts w:cstheme="minorHAnsi"/>
@@ -502,6 +507,224 @@
           </w:tcPr>
           <w:p>
             <w:pPr>
+              <w:spacing w:line="276" w:lineRule="auto"/>
+              <w:cnfStyle w:val="000000100000" w:firstRow="0" w:lastRow="0" w:firstColumn="0" w:lastColumn="0" w:oddVBand="0" w:evenVBand="0" w:oddHBand="1" w:evenHBand="0" w:firstRowFirstColumn="0" w:firstRowLastColumn="0" w:lastRowFirstColumn="0" w:lastRowLastColumn="0"/>
+              <w:rPr>
+                <w:rFonts w:cstheme="minorHAnsi"/>
+                <w:b/>
+                <w:bCs/>
+              </w:rPr>
+            </w:pPr>
+          </w:p>
+        </w:tc>
+      </w:tr>
+      <w:tr>
+        <w:trPr>
+          <w:trHeight w:val="243"/>
+        </w:trPr>
+        <w:tc>
+          <w:tcPr>
+            <w:cnfStyle w:val="001000000000" w:firstRow="0" w:lastRow="0" w:firstColumn="1" w:lastColumn="0" w:oddVBand="0" w:evenVBand="0" w:oddHBand="0" w:evenHBand="0" w:firstRowFirstColumn="0" w:firstRowLastColumn="0" w:lastRowFirstColumn="0" w:lastRowLastColumn="0"/>
+            <w:tcW w:w="1530" w:type="dxa"/>
+            <w:tcBorders>
+              <w:top w:val="nil"/>
+              <w:left w:val="nil"/>
+              <w:bottom w:val="nil"/>
+              <w:right w:val="nil"/>
+            </w:tcBorders>
+            <w:shd w:val="clear" w:color="auto" w:fill="FFFFFF" w:themeFill="background1"/>
+          </w:tcPr>
+          <w:p>
+            <w:pPr>
+              <w:spacing w:before="20" w:after="20"/>
+              <w:rPr>
+                <w:rFonts w:cstheme="minorHAnsi"/>
+              </w:rPr>
+            </w:pPr>
+            <w:r>
+              <w:rPr>
+                <w:rFonts w:cstheme="minorHAnsi"/>
+                <w:b w:val="0"/>
+                <w:bCs w:val="0"/>
+              </w:rPr>
+              <w:t>Email</w:t>
+            </w:r>
+            <w:r>
+              <w:rPr>
+                <w:rFonts w:cstheme="minorHAnsi"/>
+                <w:b w:val="0"/>
+                <w:bCs w:val="0"/>
+              </w:rPr>
+              <w:t>:</w:t>
+            </w:r>
+          </w:p>
+        </w:tc>
+        <w:tc>
+          <w:tcPr>
+            <w:tcW w:w="3960" w:type="dxa"/>
+            <w:tcBorders>
+              <w:top w:val="nil"/>
+              <w:left w:val="nil"/>
+              <w:bottom w:val="nil"/>
+              <w:right w:val="nil"/>
+            </w:tcBorders>
+            <w:shd w:val="clear" w:color="auto" w:fill="FFFFFF" w:themeFill="background1"/>
+          </w:tcPr>
+          <w:p>
+            <w:pPr>
+              <w:spacing w:before="20" w:after="20"/>
+              <w:cnfStyle w:val="000000000000" w:firstRow="0" w:lastRow="0" w:firstColumn="0" w:lastColumn="0" w:oddVBand="0" w:evenVBand="0" w:oddHBand="0" w:evenHBand="0" w:firstRowFirstColumn="0" w:firstRowLastColumn="0" w:lastRowFirstColumn="0" w:lastRowLastColumn="0"/>
+              <w:rPr>
+                <w:rFonts w:cstheme="minorHAnsi"/>
+                <w:b/>
+                <w:bCs/>
+              </w:rPr>
+            </w:pPr>
+          </w:p>
+        </w:tc>
+        <w:tc>
+          <w:tcPr>
+            <w:tcW w:w="1710" w:type="dxa"/>
+            <w:tcBorders>
+              <w:top w:val="nil"/>
+              <w:left w:val="nil"/>
+              <w:bottom w:val="nil"/>
+              <w:right w:val="nil"/>
+            </w:tcBorders>
+            <w:shd w:val="clear" w:color="auto" w:fill="FFFFFF" w:themeFill="background1"/>
+          </w:tcPr>
+          <w:p>
+            <w:pPr>
+              <w:spacing w:line="276" w:lineRule="auto"/>
+              <w:cnfStyle w:val="000000000000" w:firstRow="0" w:lastRow="0" w:firstColumn="0" w:lastColumn="0" w:oddVBand="0" w:evenVBand="0" w:oddHBand="0" w:evenHBand="0" w:firstRowFirstColumn="0" w:firstRowLastColumn="0" w:lastRowFirstColumn="0" w:lastRowLastColumn="0"/>
+              <w:rPr>
+                <w:rFonts w:cstheme="minorHAnsi"/>
+                <w:b/>
+                <w:bCs/>
+              </w:rPr>
+            </w:pPr>
+          </w:p>
+        </w:tc>
+        <w:tc>
+          <w:tcPr>
+            <w:tcW w:w="3505" w:type="dxa"/>
+            <w:tcBorders>
+              <w:top w:val="nil"/>
+              <w:left w:val="nil"/>
+              <w:bottom w:val="nil"/>
+              <w:right w:val="nil"/>
+            </w:tcBorders>
+            <w:shd w:val="clear" w:color="auto" w:fill="FFFFFF" w:themeFill="background1"/>
+          </w:tcPr>
+          <w:p>
+            <w:pPr>
+              <w:spacing w:line="276" w:lineRule="auto"/>
+              <w:cnfStyle w:val="000000000000" w:firstRow="0" w:lastRow="0" w:firstColumn="0" w:lastColumn="0" w:oddVBand="0" w:evenVBand="0" w:oddHBand="0" w:evenHBand="0" w:firstRowFirstColumn="0" w:firstRowLastColumn="0" w:lastRowFirstColumn="0" w:lastRowLastColumn="0"/>
+              <w:rPr>
+                <w:rFonts w:cstheme="minorHAnsi"/>
+                <w:b/>
+                <w:bCs/>
+              </w:rPr>
+            </w:pPr>
+          </w:p>
+        </w:tc>
+      </w:tr>
+      <w:tr>
+        <w:trPr>
+          <w:cnfStyle w:val="000000100000" w:firstRow="0" w:lastRow="0" w:firstColumn="0" w:lastColumn="0" w:oddVBand="0" w:evenVBand="0" w:oddHBand="1" w:evenHBand="0" w:firstRowFirstColumn="0" w:firstRowLastColumn="0" w:lastRowFirstColumn="0" w:lastRowLastColumn="0"/>
+          <w:trHeight w:val="70"/>
+        </w:trPr>
+        <w:tc>
+          <w:tcPr>
+            <w:cnfStyle w:val="001000000000" w:firstRow="0" w:lastRow="0" w:firstColumn="1" w:lastColumn="0" w:oddVBand="0" w:evenVBand="0" w:oddHBand="0" w:evenHBand="0" w:firstRowFirstColumn="0" w:firstRowLastColumn="0" w:lastRowFirstColumn="0" w:lastRowLastColumn="0"/>
+            <w:tcW w:w="1530" w:type="dxa"/>
+            <w:tcBorders>
+              <w:top w:val="nil"/>
+              <w:left w:val="nil"/>
+              <w:bottom w:val="nil"/>
+              <w:right w:val="nil"/>
+            </w:tcBorders>
+            <w:shd w:val="clear" w:color="auto" w:fill="FFFFFF" w:themeFill="background1"/>
+          </w:tcPr>
+          <w:p>
+            <w:pPr>
+              <w:spacing w:before="20" w:after="20"/>
+              <w:rPr>
+                <w:rFonts w:cstheme="minorHAnsi"/>
+                <w:b w:val="0"/>
+                <w:bCs w:val="0"/>
+              </w:rPr>
+            </w:pPr>
+            <w:r>
+              <w:rPr>
+                <w:rFonts w:cstheme="minorHAnsi"/>
+                <w:b w:val="0"/>
+                <w:bCs w:val="0"/>
+              </w:rPr>
+              <w:t>Tax ID:</w:t>
+            </w:r>
+          </w:p>
+        </w:tc>
+        <w:tc>
+          <w:tcPr>
+            <w:tcW w:w="3960" w:type="dxa"/>
+            <w:tcBorders>
+              <w:top w:val="nil"/>
+              <w:left w:val="nil"/>
+              <w:bottom w:val="nil"/>
+              <w:right w:val="nil"/>
+            </w:tcBorders>
+            <w:shd w:val="clear" w:color="auto" w:fill="FFFFFF" w:themeFill="background1"/>
+          </w:tcPr>
+          <w:p>
+            <w:pPr>
+              <w:spacing w:before="20" w:after="20"/>
+              <w:cnfStyle w:val="000000100000" w:firstRow="0" w:lastRow="0" w:firstColumn="0" w:lastColumn="0" w:oddVBand="0" w:evenVBand="0" w:oddHBand="1" w:evenHBand="0" w:firstRowFirstColumn="0" w:firstRowLastColumn="0" w:lastRowFirstColumn="0" w:lastRowLastColumn="0"/>
+              <w:rPr>
+                <w:rFonts w:cstheme="minorHAnsi"/>
+                <w:b/>
+                <w:bCs/>
+              </w:rPr>
+            </w:pPr>
+          </w:p>
+        </w:tc>
+        <w:tc>
+          <w:tcPr>
+            <w:tcW w:w="1710" w:type="dxa"/>
+            <w:tcBorders>
+              <w:top w:val="nil"/>
+              <w:left w:val="nil"/>
+              <w:bottom w:val="nil"/>
+              <w:right w:val="nil"/>
+            </w:tcBorders>
+            <w:shd w:val="clear" w:color="auto" w:fill="FFFFFF" w:themeFill="background1"/>
+          </w:tcPr>
+          <w:p>
+            <w:pPr>
+              <w:spacing w:line="276" w:lineRule="auto"/>
+              <w:cnfStyle w:val="000000100000" w:firstRow="0" w:lastRow="0" w:firstColumn="0" w:lastColumn="0" w:oddVBand="0" w:evenVBand="0" w:oddHBand="1" w:evenHBand="0" w:firstRowFirstColumn="0" w:firstRowLastColumn="0" w:lastRowFirstColumn="0" w:lastRowLastColumn="0"/>
+              <w:rPr>
+                <w:rFonts w:cstheme="minorHAnsi"/>
+                <w:b/>
+                <w:bCs/>
+              </w:rPr>
+            </w:pPr>
+          </w:p>
+        </w:tc>
+        <w:tc>
+          <w:tcPr>
+            <w:tcW w:w="3505" w:type="dxa"/>
+            <w:tcBorders>
+              <w:top w:val="nil"/>
+              <w:left w:val="nil"/>
+              <w:bottom w:val="nil"/>
+              <w:right w:val="nil"/>
+            </w:tcBorders>
+            <w:shd w:val="clear" w:color="auto" w:fill="FFFFFF" w:themeFill="background1"/>
+          </w:tcPr>
+          <w:p>
+            <w:pPr>
+              <w:spacing w:line="276" w:lineRule="auto"/>
               <w:cnfStyle w:val="000000100000" w:firstRow="0" w:lastRow="0" w:firstColumn="0" w:lastColumn="0" w:oddVBand="0" w:evenVBand="0" w:oddHBand="1" w:evenHBand="0" w:firstRowFirstColumn="0" w:firstRowLastColumn="0" w:lastRowFirstColumn="0" w:lastRowLastColumn="0"/>
               <w:rPr>
                 <w:rFonts w:cstheme="minorHAnsi"/>
@@ -533,34 +756,8 @@
               <w:spacing w:before="20" w:after="20"/>
               <w:rPr>
                 <w:rFonts w:cstheme="minorHAnsi"/>
-                <w:b w:val="0"/>
-                <w:bCs w:val="0"/>
-              </w:rPr>
-            </w:pPr>
-            <w:r>
-              <w:rPr>
-                <w:rFonts w:cstheme="minorHAnsi"/>
-                <w:b w:val="0"/>
-                <w:bCs w:val="0"/>
-              </w:rPr>
-              <w:t>Email</w:t>
-            </w:r>
-            <w:r>
-              <w:rPr>
-                <w:rFonts w:cstheme="minorHAnsi"/>
-                <w:b w:val="0"/>
-                <w:bCs w:val="0"/>
-              </w:rPr>
-              <w:t>:</w:t>
-            </w:r>
-            <w:r>
-              <w:rPr>
-                <w:rFonts w:cstheme="minorHAnsi"/>
-                <w:b w:val="0"/>
-                <w:bCs w:val="0"/>
-              </w:rPr>
-              <w:t xml:space="preserve"> </w:t>
-            </w:r>
+              </w:rPr>
+            </w:pPr>
           </w:p>
         </w:tc>
         <w:tc>
@@ -599,6 +796,7 @@
           </w:tcPr>
           <w:p>
             <w:pPr>
+              <w:spacing w:line="276" w:lineRule="auto"/>
               <w:cnfStyle w:val="000000000000" w:firstRow="0" w:lastRow="0" w:firstColumn="0" w:lastColumn="0" w:oddVBand="0" w:evenVBand="0" w:oddHBand="0" w:evenHBand="0" w:firstRowFirstColumn="0" w:firstRowLastColumn="0" w:lastRowFirstColumn="0" w:lastRowLastColumn="0"/>
               <w:rPr>
                 <w:rFonts w:cstheme="minorHAnsi"/>
@@ -621,6 +819,7 @@
           </w:tcPr>
           <w:p>
             <w:pPr>
+              <w:spacing w:line="276" w:lineRule="auto"/>
               <w:cnfStyle w:val="000000000000" w:firstRow="0" w:lastRow="0" w:firstColumn="0" w:lastColumn="0" w:oddVBand="0" w:evenVBand="0" w:oddHBand="0" w:evenHBand="0" w:firstRowFirstColumn="0" w:firstRowLastColumn="0" w:lastRowFirstColumn="0" w:lastRowLastColumn="0"/>
               <w:rPr>
                 <w:rFonts w:cstheme="minorHAnsi"/>
@@ -961,6 +1160,8 @@
               <w:spacing w:before="20" w:after="20"/>
               <w:rPr>
                 <w:rFonts w:cstheme="minorHAnsi"/>
+                <w:b w:val="0"/>
+                <w:bCs w:val="0"/>
               </w:rPr>
             </w:pPr>
           </w:p>

</xml_diff>

<commit_message>
update: add feature import export data
</commit_message>
<xml_diff>
--- a/public/preview/template-user.docx
+++ b/public/preview/template-user.docx
@@ -52,22 +52,22 @@
         <w:tblLook w:val="04A0" w:firstRow="1" w:lastRow="0" w:firstColumn="1" w:lastColumn="0" w:noHBand="0" w:noVBand="1"/>
       </w:tblPr>
       <w:tblGrid>
-        <w:gridCol w:w="1530"/>
-        <w:gridCol w:w="5125"/>
-        <w:gridCol w:w="1080"/>
-        <w:gridCol w:w="2160"/>
+        <w:gridCol w:w="2700"/>
+        <w:gridCol w:w="4080"/>
+        <w:gridCol w:w="1057"/>
+        <w:gridCol w:w="2058"/>
       </w:tblGrid>
       <w:tr>
         <w:trPr>
           <w:gridAfter w:val="2"/>
           <w:cnfStyle w:val="100000000000" w:firstRow="1" w:lastRow="0" w:firstColumn="0" w:lastColumn="0" w:oddVBand="0" w:evenVBand="0" w:oddHBand="0" w:evenHBand="0" w:firstRowFirstColumn="0" w:firstRowLastColumn="0" w:lastRowFirstColumn="0" w:lastRowLastColumn="0"/>
-          <w:wAfter w:w="3240" w:type="dxa"/>
+          <w:wAfter w:w="3115" w:type="dxa"/>
           <w:trHeight w:val="368"/>
         </w:trPr>
         <w:tc>
           <w:tcPr>
             <w:cnfStyle w:val="001000000000" w:firstRow="0" w:lastRow="0" w:firstColumn="1" w:lastColumn="0" w:oddVBand="0" w:evenVBand="0" w:oddHBand="0" w:evenHBand="0" w:firstRowFirstColumn="0" w:firstRowLastColumn="0" w:lastRowFirstColumn="0" w:lastRowLastColumn="0"/>
-            <w:tcW w:w="6655" w:type="dxa"/>
+            <w:tcW w:w="6780" w:type="dxa"/>
             <w:gridSpan w:val="2"/>
             <w:tcBorders>
               <w:top w:val="nil"/>
@@ -124,7 +124,7 @@
         <w:tc>
           <w:tcPr>
             <w:cnfStyle w:val="001000000000" w:firstRow="0" w:lastRow="0" w:firstColumn="1" w:lastColumn="0" w:oddVBand="0" w:evenVBand="0" w:oddHBand="0" w:evenHBand="0" w:firstRowFirstColumn="0" w:firstRowLastColumn="0" w:lastRowFirstColumn="0" w:lastRowLastColumn="0"/>
-            <w:tcW w:w="1530" w:type="dxa"/>
+            <w:tcW w:w="2700" w:type="dxa"/>
             <w:tcBorders>
               <w:top w:val="nil"/>
               <w:left w:val="nil"/>
@@ -154,7 +154,7 @@
         </w:tc>
         <w:tc>
           <w:tcPr>
-            <w:tcW w:w="5125" w:type="dxa"/>
+            <w:tcW w:w="4080" w:type="dxa"/>
             <w:tcBorders>
               <w:top w:val="nil"/>
               <w:left w:val="nil"/>
@@ -175,7 +175,7 @@
         </w:tc>
         <w:tc>
           <w:tcPr>
-            <w:tcW w:w="1080" w:type="dxa"/>
+            <w:tcW w:w="1057" w:type="dxa"/>
             <w:tcBorders>
               <w:top w:val="nil"/>
               <w:left w:val="nil"/>
@@ -206,7 +206,7 @@
         </w:tc>
         <w:tc>
           <w:tcPr>
-            <w:tcW w:w="2160" w:type="dxa"/>
+            <w:tcW w:w="2058" w:type="dxa"/>
             <w:tcBorders>
               <w:top w:val="nil"/>
               <w:left w:val="nil"/>
@@ -239,7 +239,7 @@
         <w:tc>
           <w:tcPr>
             <w:cnfStyle w:val="001000000000" w:firstRow="0" w:lastRow="0" w:firstColumn="1" w:lastColumn="0" w:oddVBand="0" w:evenVBand="0" w:oddHBand="0" w:evenHBand="0" w:firstRowFirstColumn="0" w:firstRowLastColumn="0" w:lastRowFirstColumn="0" w:lastRowLastColumn="0"/>
-            <w:tcW w:w="1530" w:type="dxa"/>
+            <w:tcW w:w="2700" w:type="dxa"/>
             <w:tcBorders>
               <w:top w:val="nil"/>
               <w:left w:val="nil"/>
@@ -277,7 +277,7 @@
         </w:tc>
         <w:tc>
           <w:tcPr>
-            <w:tcW w:w="5125" w:type="dxa"/>
+            <w:tcW w:w="4080" w:type="dxa"/>
             <w:tcBorders>
               <w:top w:val="nil"/>
               <w:left w:val="nil"/>
@@ -300,7 +300,7 @@
         </w:tc>
         <w:tc>
           <w:tcPr>
-            <w:tcW w:w="1080" w:type="dxa"/>
+            <w:tcW w:w="1057" w:type="dxa"/>
             <w:tcBorders>
               <w:top w:val="nil"/>
               <w:left w:val="nil"/>
@@ -331,7 +331,7 @@
         </w:tc>
         <w:tc>
           <w:tcPr>
-            <w:tcW w:w="2160" w:type="dxa"/>
+            <w:tcW w:w="2058" w:type="dxa"/>
             <w:tcBorders>
               <w:top w:val="nil"/>
               <w:left w:val="nil"/>
@@ -365,24 +365,25 @@
         <w:tc>
           <w:tcPr>
             <w:cnfStyle w:val="001000000000" w:firstRow="0" w:lastRow="0" w:firstColumn="1" w:lastColumn="0" w:oddVBand="0" w:evenVBand="0" w:oddHBand="0" w:evenHBand="0" w:firstRowFirstColumn="0" w:firstRowLastColumn="0" w:lastRowFirstColumn="0" w:lastRowLastColumn="0"/>
-            <w:tcW w:w="1530" w:type="dxa"/>
-            <w:tcBorders>
-              <w:top w:val="nil"/>
-              <w:left w:val="nil"/>
-              <w:bottom w:val="nil"/>
-              <w:right w:val="nil"/>
-            </w:tcBorders>
-            <w:shd w:val="clear" w:color="auto" w:fill="FFFFFF" w:themeFill="background1"/>
-          </w:tcPr>
-          <w:p>
-            <w:pPr>
-              <w:spacing w:before="20" w:after="20"/>
-              <w:rPr>
-                <w:rFonts w:cstheme="minorHAnsi"/>
-                <w:b w:val="0"/>
-                <w:bCs w:val="0"/>
-              </w:rPr>
-            </w:pPr>
+            <w:tcW w:w="2700" w:type="dxa"/>
+            <w:tcBorders>
+              <w:top w:val="nil"/>
+              <w:left w:val="nil"/>
+              <w:bottom w:val="nil"/>
+              <w:right w:val="nil"/>
+            </w:tcBorders>
+            <w:shd w:val="clear" w:color="auto" w:fill="FFFFFF" w:themeFill="background1"/>
+          </w:tcPr>
+          <w:p>
+            <w:pPr>
+              <w:spacing w:before="20" w:after="20"/>
+              <w:rPr>
+                <w:rFonts w:cstheme="minorHAnsi"/>
+                <w:b w:val="0"/>
+                <w:bCs w:val="0"/>
+              </w:rPr>
+            </w:pPr>
+            <w:proofErr w:type="spellStart"/>
             <w:r>
               <w:rPr>
                 <w:rFonts w:cstheme="minorHAnsi"/>
@@ -391,6 +392,7 @@
               </w:rPr>
               <w:t>ZipCode</w:t>
             </w:r>
+            <w:proofErr w:type="spellEnd"/>
             <w:r>
               <w:rPr>
                 <w:rFonts w:cstheme="minorHAnsi"/>
@@ -403,17 +405,20 @@
         </w:tc>
         <w:tc>
           <w:tcPr>
-            <w:tcW w:w="5125" w:type="dxa"/>
-            <w:tcBorders>
-              <w:top w:val="nil"/>
-              <w:left w:val="nil"/>
-              <w:bottom w:val="nil"/>
-              <w:right w:val="nil"/>
-            </w:tcBorders>
-            <w:shd w:val="clear" w:color="auto" w:fill="FFFFFF" w:themeFill="background1"/>
-          </w:tcPr>
-          <w:p>
-            <w:pPr>
+            <w:tcW w:w="4080" w:type="dxa"/>
+            <w:tcBorders>
+              <w:top w:val="nil"/>
+              <w:left w:val="nil"/>
+              <w:bottom w:val="nil"/>
+              <w:right w:val="nil"/>
+            </w:tcBorders>
+            <w:shd w:val="clear" w:color="auto" w:fill="FFFFFF" w:themeFill="background1"/>
+          </w:tcPr>
+          <w:p>
+            <w:pPr>
+              <w:tabs>
+                <w:tab w:val="left" w:pos="735"/>
+              </w:tabs>
               <w:spacing w:before="20" w:after="20"/>
               <w:cnfStyle w:val="000000100000" w:firstRow="0" w:lastRow="0" w:firstColumn="0" w:lastColumn="0" w:oddVBand="0" w:evenVBand="0" w:oddHBand="1" w:evenHBand="0" w:firstRowFirstColumn="0" w:firstRowLastColumn="0" w:lastRowFirstColumn="0" w:lastRowLastColumn="0"/>
               <w:rPr>
@@ -422,11 +427,17 @@
                 <w:bCs/>
               </w:rPr>
             </w:pPr>
-          </w:p>
-        </w:tc>
-        <w:tc>
-          <w:tcPr>
-            <w:tcW w:w="1080" w:type="dxa"/>
+            <w:r>
+              <w:rPr>
+                <w:rFonts w:cstheme="minorHAnsi"/>
+              </w:rPr>
+              <w:tab/>
+            </w:r>
+          </w:p>
+        </w:tc>
+        <w:tc>
+          <w:tcPr>
+            <w:tcW w:w="1057" w:type="dxa"/>
             <w:tcBorders>
               <w:top w:val="nil"/>
               <w:left w:val="nil"/>
@@ -449,7 +460,7 @@
         </w:tc>
         <w:tc>
           <w:tcPr>
-            <w:tcW w:w="2160" w:type="dxa"/>
+            <w:tcW w:w="2058" w:type="dxa"/>
             <w:tcBorders>
               <w:top w:val="nil"/>
               <w:left w:val="nil"/>
@@ -478,7 +489,7 @@
         <w:tc>
           <w:tcPr>
             <w:cnfStyle w:val="001000000000" w:firstRow="0" w:lastRow="0" w:firstColumn="1" w:lastColumn="0" w:oddVBand="0" w:evenVBand="0" w:oddHBand="0" w:evenHBand="0" w:firstRowFirstColumn="0" w:firstRowLastColumn="0" w:lastRowFirstColumn="0" w:lastRowLastColumn="0"/>
-            <w:tcW w:w="1530" w:type="dxa"/>
+            <w:tcW w:w="2700" w:type="dxa"/>
             <w:tcBorders>
               <w:top w:val="nil"/>
               <w:left w:val="nil"/>
@@ -514,7 +525,7 @@
         </w:tc>
         <w:tc>
           <w:tcPr>
-            <w:tcW w:w="5125" w:type="dxa"/>
+            <w:tcW w:w="4080" w:type="dxa"/>
             <w:tcBorders>
               <w:top w:val="nil"/>
               <w:left w:val="nil"/>
@@ -537,7 +548,7 @@
         </w:tc>
         <w:tc>
           <w:tcPr>
-            <w:tcW w:w="1080" w:type="dxa"/>
+            <w:tcW w:w="1057" w:type="dxa"/>
             <w:tcBorders>
               <w:top w:val="nil"/>
               <w:left w:val="nil"/>
@@ -560,7 +571,7 @@
         </w:tc>
         <w:tc>
           <w:tcPr>
-            <w:tcW w:w="2160" w:type="dxa"/>
+            <w:tcW w:w="2058" w:type="dxa"/>
             <w:tcBorders>
               <w:top w:val="nil"/>
               <w:left w:val="nil"/>
@@ -590,7 +601,7 @@
         <w:tc>
           <w:tcPr>
             <w:cnfStyle w:val="001000000000" w:firstRow="0" w:lastRow="0" w:firstColumn="1" w:lastColumn="0" w:oddVBand="0" w:evenVBand="0" w:oddHBand="0" w:evenHBand="0" w:firstRowFirstColumn="0" w:firstRowLastColumn="0" w:lastRowFirstColumn="0" w:lastRowLastColumn="0"/>
-            <w:tcW w:w="1530" w:type="dxa"/>
+            <w:tcW w:w="2700" w:type="dxa"/>
             <w:tcBorders>
               <w:top w:val="nil"/>
               <w:left w:val="nil"/>
@@ -636,7 +647,7 @@
         </w:tc>
         <w:tc>
           <w:tcPr>
-            <w:tcW w:w="5125" w:type="dxa"/>
+            <w:tcW w:w="4080" w:type="dxa"/>
             <w:tcBorders>
               <w:top w:val="nil"/>
               <w:left w:val="nil"/>
@@ -659,7 +670,7 @@
         </w:tc>
         <w:tc>
           <w:tcPr>
-            <w:tcW w:w="1080" w:type="dxa"/>
+            <w:tcW w:w="1057" w:type="dxa"/>
             <w:tcBorders>
               <w:top w:val="nil"/>
               <w:left w:val="nil"/>
@@ -682,7 +693,7 @@
         </w:tc>
         <w:tc>
           <w:tcPr>
-            <w:tcW w:w="2160" w:type="dxa"/>
+            <w:tcW w:w="2058" w:type="dxa"/>
             <w:tcBorders>
               <w:top w:val="nil"/>
               <w:left w:val="nil"/>
@@ -1041,6 +1052,14 @@
                 <w:bCs w:val="0"/>
               </w:rPr>
             </w:pPr>
+            <w:r>
+              <w:rPr>
+                <w:rFonts w:cstheme="minorHAnsi"/>
+                <w:b w:val="0"/>
+                <w:bCs w:val="0"/>
+              </w:rPr>
+              <w:t>PO</w:t>
+            </w:r>
           </w:p>
         </w:tc>
         <w:tc>
@@ -1185,7 +1204,25 @@
                 <w:b w:val="0"/>
                 <w:bCs w:val="0"/>
               </w:rPr>
-              <w:t>Revenue Youtube MM/YYYY</w:t>
+              <w:t xml:space="preserve">Revenue </w:t>
+            </w:r>
+            <w:proofErr w:type="spellStart"/>
+            <w:r>
+              <w:rPr>
+                <w:rFonts w:cstheme="minorHAnsi"/>
+                <w:b w:val="0"/>
+                <w:bCs w:val="0"/>
+              </w:rPr>
+              <w:t>Youtube</w:t>
+            </w:r>
+            <w:proofErr w:type="spellEnd"/>
+            <w:r>
+              <w:rPr>
+                <w:rFonts w:cstheme="minorHAnsi"/>
+                <w:b w:val="0"/>
+                <w:bCs w:val="0"/>
+              </w:rPr>
+              <w:t xml:space="preserve"> MM/YYYY</w:t>
             </w:r>
           </w:p>
         </w:tc>
@@ -1365,8 +1402,8 @@
         <w:tblLook w:val="04A0" w:firstRow="1" w:lastRow="0" w:firstColumn="1" w:lastColumn="0" w:noHBand="0" w:noVBand="1"/>
       </w:tblPr>
       <w:tblGrid>
-        <w:gridCol w:w="2245"/>
-        <w:gridCol w:w="7115"/>
+        <w:gridCol w:w="2700"/>
+        <w:gridCol w:w="6660"/>
       </w:tblGrid>
       <w:tr>
         <w:trPr>
@@ -1411,7 +1448,7 @@
         <w:tc>
           <w:tcPr>
             <w:cnfStyle w:val="001000000000" w:firstRow="0" w:lastRow="0" w:firstColumn="1" w:lastColumn="0" w:oddVBand="0" w:evenVBand="0" w:oddHBand="0" w:evenHBand="0" w:firstRowFirstColumn="0" w:firstRowLastColumn="0" w:lastRowFirstColumn="0" w:lastRowLastColumn="0"/>
-            <w:tcW w:w="2245" w:type="dxa"/>
+            <w:tcW w:w="2700" w:type="dxa"/>
             <w:tcBorders>
               <w:top w:val="nil"/>
               <w:left w:val="nil"/>
@@ -1448,7 +1485,7 @@
         </w:tc>
         <w:tc>
           <w:tcPr>
-            <w:tcW w:w="7115" w:type="dxa"/>
+            <w:tcW w:w="6660" w:type="dxa"/>
             <w:tcBorders>
               <w:top w:val="nil"/>
               <w:left w:val="nil"/>
@@ -1473,7 +1510,7 @@
         <w:tc>
           <w:tcPr>
             <w:cnfStyle w:val="001000000000" w:firstRow="0" w:lastRow="0" w:firstColumn="1" w:lastColumn="0" w:oddVBand="0" w:evenVBand="0" w:oddHBand="0" w:evenHBand="0" w:firstRowFirstColumn="0" w:firstRowLastColumn="0" w:lastRowFirstColumn="0" w:lastRowLastColumn="0"/>
-            <w:tcW w:w="2245" w:type="dxa"/>
+            <w:tcW w:w="2700" w:type="dxa"/>
             <w:tcBorders>
               <w:top w:val="nil"/>
               <w:left w:val="nil"/>
@@ -1510,7 +1547,7 @@
         </w:tc>
         <w:tc>
           <w:tcPr>
-            <w:tcW w:w="7115" w:type="dxa"/>
+            <w:tcW w:w="6660" w:type="dxa"/>
             <w:tcBorders>
               <w:top w:val="nil"/>
               <w:left w:val="nil"/>
@@ -1538,7 +1575,7 @@
         <w:tc>
           <w:tcPr>
             <w:cnfStyle w:val="001000000000" w:firstRow="0" w:lastRow="0" w:firstColumn="1" w:lastColumn="0" w:oddVBand="0" w:evenVBand="0" w:oddHBand="0" w:evenHBand="0" w:firstRowFirstColumn="0" w:firstRowLastColumn="0" w:lastRowFirstColumn="0" w:lastRowLastColumn="0"/>
-            <w:tcW w:w="2245" w:type="dxa"/>
+            <w:tcW w:w="2700" w:type="dxa"/>
             <w:tcBorders>
               <w:top w:val="nil"/>
               <w:left w:val="nil"/>
@@ -1575,7 +1612,7 @@
         </w:tc>
         <w:tc>
           <w:tcPr>
-            <w:tcW w:w="7115" w:type="dxa"/>
+            <w:tcW w:w="6660" w:type="dxa"/>
             <w:tcBorders>
               <w:top w:val="nil"/>
               <w:left w:val="nil"/>
@@ -1600,7 +1637,7 @@
         <w:tc>
           <w:tcPr>
             <w:cnfStyle w:val="001000000000" w:firstRow="0" w:lastRow="0" w:firstColumn="1" w:lastColumn="0" w:oddVBand="0" w:evenVBand="0" w:oddHBand="0" w:evenHBand="0" w:firstRowFirstColumn="0" w:firstRowLastColumn="0" w:lastRowFirstColumn="0" w:lastRowLastColumn="0"/>
-            <w:tcW w:w="2245" w:type="dxa"/>
+            <w:tcW w:w="2700" w:type="dxa"/>
             <w:tcBorders>
               <w:top w:val="nil"/>
               <w:left w:val="nil"/>
@@ -1639,7 +1676,7 @@
         </w:tc>
         <w:tc>
           <w:tcPr>
-            <w:tcW w:w="7115" w:type="dxa"/>
+            <w:tcW w:w="6660" w:type="dxa"/>
             <w:tcBorders>
               <w:top w:val="nil"/>
               <w:left w:val="nil"/>
@@ -1667,7 +1704,7 @@
         <w:tc>
           <w:tcPr>
             <w:cnfStyle w:val="001000000000" w:firstRow="0" w:lastRow="0" w:firstColumn="1" w:lastColumn="0" w:oddVBand="0" w:evenVBand="0" w:oddHBand="0" w:evenHBand="0" w:firstRowFirstColumn="0" w:firstRowLastColumn="0" w:lastRowFirstColumn="0" w:lastRowLastColumn="0"/>
-            <w:tcW w:w="2245" w:type="dxa"/>
+            <w:tcW w:w="2700" w:type="dxa"/>
             <w:tcBorders>
               <w:top w:val="nil"/>
               <w:left w:val="nil"/>
@@ -1696,7 +1733,7 @@
         </w:tc>
         <w:tc>
           <w:tcPr>
-            <w:tcW w:w="7115" w:type="dxa"/>
+            <w:tcW w:w="6660" w:type="dxa"/>
             <w:tcBorders>
               <w:top w:val="nil"/>
               <w:left w:val="nil"/>
@@ -1721,7 +1758,7 @@
         <w:tc>
           <w:tcPr>
             <w:cnfStyle w:val="001000000000" w:firstRow="0" w:lastRow="0" w:firstColumn="1" w:lastColumn="0" w:oddVBand="0" w:evenVBand="0" w:oddHBand="0" w:evenHBand="0" w:firstRowFirstColumn="0" w:firstRowLastColumn="0" w:lastRowFirstColumn="0" w:lastRowLastColumn="0"/>
-            <w:tcW w:w="2245" w:type="dxa"/>
+            <w:tcW w:w="2700" w:type="dxa"/>
             <w:tcBorders>
               <w:top w:val="nil"/>
               <w:left w:val="nil"/>
@@ -1758,7 +1795,7 @@
         </w:tc>
         <w:tc>
           <w:tcPr>
-            <w:tcW w:w="7115" w:type="dxa"/>
+            <w:tcW w:w="6660" w:type="dxa"/>
             <w:tcBorders>
               <w:top w:val="nil"/>
               <w:left w:val="nil"/>
@@ -1786,7 +1823,7 @@
         <w:tc>
           <w:tcPr>
             <w:cnfStyle w:val="001000000000" w:firstRow="0" w:lastRow="0" w:firstColumn="1" w:lastColumn="0" w:oddVBand="0" w:evenVBand="0" w:oddHBand="0" w:evenHBand="0" w:firstRowFirstColumn="0" w:firstRowLastColumn="0" w:lastRowFirstColumn="0" w:lastRowLastColumn="0"/>
-            <w:tcW w:w="2245" w:type="dxa"/>
+            <w:tcW w:w="2700" w:type="dxa"/>
             <w:tcBorders>
               <w:top w:val="nil"/>
               <w:left w:val="nil"/>
@@ -1823,7 +1860,7 @@
         </w:tc>
         <w:tc>
           <w:tcPr>
-            <w:tcW w:w="7115" w:type="dxa"/>
+            <w:tcW w:w="6660" w:type="dxa"/>
             <w:tcBorders>
               <w:top w:val="nil"/>
               <w:left w:val="nil"/>

</xml_diff>